<commit_message>
Atualização de templates docx dos pareceres com novas tags
</commit_message>
<xml_diff>
--- a/dados/modelo_deferido_pp.docx
+++ b/dados/modelo_deferido_pp.docx
@@ -272,8 +272,6 @@
               </w:rPr>
               <w:t>{{PROCESSO}}</w:t>
             </w:r>
-            <w:bookmarkStart w:id="0" w:name="_GoBack"/>
-            <w:bookmarkEnd w:id="0"/>
             <w:r>
               <w:rPr>
                 <w:rFonts w:ascii="Times New Roman" w:hAnsi="Times New Roman" w:cs="Times New Roman"/>
@@ -419,30 +417,8 @@
     <w:p>
       <w:pPr>
         <w:pStyle w:val="Corpodetexto"/>
-        <w:spacing w:beforeLines="40" w:before="96" w:line="276" w:lineRule="auto"/>
-        <w:ind w:right="18"/>
-        <w:jc w:val="both"/>
-        <w:rPr>
-          <w:rFonts w:ascii="Times New Roman" w:hAnsi="Times New Roman" w:cs="Times New Roman"/>
-        </w:rPr>
-      </w:pPr>
-    </w:p>
-    <w:p>
-      <w:pPr>
-        <w:pStyle w:val="Corpodetexto"/>
-        <w:spacing w:line="276" w:lineRule="auto"/>
-        <w:ind w:right="18"/>
-        <w:jc w:val="both"/>
-        <w:rPr>
-          <w:rFonts w:ascii="Times New Roman" w:hAnsi="Times New Roman" w:cs="Times New Roman"/>
-        </w:rPr>
-      </w:pPr>
-    </w:p>
-    <w:p>
-      <w:pPr>
-        <w:pStyle w:val="Corpodetexto"/>
-        <w:spacing w:line="276" w:lineRule="auto"/>
-        <w:ind w:right="18"/>
+        <w:spacing w:line="360" w:lineRule="auto"/>
+        <w:ind w:left="590" w:right="18" w:firstLine="719"/>
         <w:jc w:val="both"/>
         <w:rPr>
           <w:rFonts w:ascii="Times New Roman" w:hAnsi="Times New Roman" w:cs="Times New Roman"/>
@@ -560,7 +536,6 @@
       <w:r>
         <w:rPr>
           <w:rFonts w:ascii="Times New Roman" w:hAnsi="Times New Roman" w:cs="Times New Roman"/>
-          <w:spacing w:val="-13"/>
         </w:rPr>
         <w:t xml:space="preserve"> </w:t>
       </w:r>
@@ -573,20 +548,18 @@
       <w:r>
         <w:rPr>
           <w:rFonts w:ascii="Times New Roman" w:hAnsi="Times New Roman" w:cs="Times New Roman"/>
-          <w:spacing w:val="-13"/>
-        </w:rPr>
-        <w:t xml:space="preserve"> </w:t>
-      </w:r>
-      <w:r>
-        <w:rPr>
-          <w:rFonts w:ascii="Times New Roman" w:hAnsi="Times New Roman" w:cs="Times New Roman"/>
-        </w:rPr>
-        <w:t>após</w:t>
-      </w:r>
-      <w:r>
-        <w:rPr>
-          <w:rFonts w:ascii="Times New Roman" w:hAnsi="Times New Roman" w:cs="Times New Roman"/>
-          <w:spacing w:val="-15"/>
+        </w:rPr>
+        <w:t xml:space="preserve"> </w:t>
+      </w:r>
+      <w:r>
+        <w:rPr>
+          <w:rFonts w:ascii="Times New Roman" w:hAnsi="Times New Roman" w:cs="Times New Roman"/>
+        </w:rPr>
+        <w:t>foi realizada</w:t>
+      </w:r>
+      <w:r>
+        <w:rPr>
+          <w:rFonts w:ascii="Times New Roman" w:hAnsi="Times New Roman" w:cs="Times New Roman"/>
         </w:rPr>
         <w:t xml:space="preserve"> </w:t>
       </w:r>
@@ -599,7 +572,6 @@
       <w:r>
         <w:rPr>
           <w:rFonts w:ascii="Times New Roman" w:hAnsi="Times New Roman" w:cs="Times New Roman"/>
-          <w:spacing w:val="-12"/>
         </w:rPr>
         <w:t xml:space="preserve"> </w:t>
       </w:r>
@@ -612,7 +584,6 @@
       <w:r>
         <w:rPr>
           <w:rFonts w:ascii="Times New Roman" w:hAnsi="Times New Roman" w:cs="Times New Roman"/>
-          <w:spacing w:val="-15"/>
         </w:rPr>
         <w:t xml:space="preserve"> </w:t>
       </w:r>
@@ -625,15 +596,14 @@
       <w:r>
         <w:rPr>
           <w:rFonts w:ascii="Times New Roman" w:hAnsi="Times New Roman" w:cs="Times New Roman"/>
-          <w:spacing w:val="-13"/>
-        </w:rPr>
-        <w:t xml:space="preserve"> </w:t>
-      </w:r>
-      <w:r>
-        <w:rPr>
-          <w:rFonts w:ascii="Times New Roman" w:hAnsi="Times New Roman" w:cs="Times New Roman"/>
-        </w:rPr>
-        <w:t>visita técnica realizada no local, constatou-se a viabilidade da execução, portanto, será gerada uma ordem de serviço.</w:t>
+        </w:rPr>
+        <w:t xml:space="preserve"> </w:t>
+      </w:r>
+      <w:r>
+        <w:rPr>
+          <w:rFonts w:ascii="Times New Roman" w:hAnsi="Times New Roman" w:cs="Times New Roman"/>
+        </w:rPr>
+        <w:t>visita técnica no local.</w:t>
       </w:r>
     </w:p>
     <w:p>
@@ -646,118 +616,18 @@
           <w:rFonts w:ascii="Times New Roman" w:hAnsi="Times New Roman" w:cs="Times New Roman"/>
         </w:rPr>
       </w:pPr>
-    </w:p>
-    <w:p>
-      <w:pPr>
-        <w:spacing w:line="360" w:lineRule="auto"/>
-        <w:ind w:left="1310"/>
-        <w:jc w:val="both"/>
-        <w:rPr>
-          <w:rFonts w:ascii="Times New Roman" w:hAnsi="Times New Roman" w:cs="Times New Roman"/>
-          <w:b/>
-          <w:spacing w:val="-2"/>
-          <w:sz w:val="24"/>
-        </w:rPr>
-      </w:pPr>
-      <w:r>
-        <w:rPr>
-          <w:rFonts w:ascii="Times New Roman" w:hAnsi="Times New Roman" w:cs="Times New Roman"/>
-          <w:b/>
-          <w:sz w:val="24"/>
-        </w:rPr>
-        <w:t>DEFERIDA</w:t>
-      </w:r>
-      <w:r>
-        <w:rPr>
-          <w:rFonts w:ascii="Times New Roman" w:hAnsi="Times New Roman" w:cs="Times New Roman"/>
-          <w:b/>
-          <w:sz w:val="24"/>
-        </w:rPr>
-        <w:t>,</w:t>
-      </w:r>
-      <w:r>
-        <w:rPr>
-          <w:rFonts w:ascii="Times New Roman" w:hAnsi="Times New Roman" w:cs="Times New Roman"/>
-          <w:b/>
-          <w:spacing w:val="-2"/>
-          <w:sz w:val="24"/>
-        </w:rPr>
-        <w:t xml:space="preserve"> </w:t>
-      </w:r>
-      <w:r>
-        <w:rPr>
-          <w:rFonts w:ascii="Times New Roman" w:hAnsi="Times New Roman" w:cs="Times New Roman"/>
-          <w:sz w:val="24"/>
-        </w:rPr>
-        <w:t>portanto</w:t>
-      </w:r>
-      <w:r>
-        <w:rPr>
-          <w:rFonts w:ascii="Times New Roman" w:hAnsi="Times New Roman" w:cs="Times New Roman"/>
-          <w:spacing w:val="-3"/>
-          <w:sz w:val="24"/>
-        </w:rPr>
-        <w:t xml:space="preserve"> </w:t>
-      </w:r>
-      <w:r>
-        <w:rPr>
-          <w:rFonts w:ascii="Times New Roman" w:hAnsi="Times New Roman" w:cs="Times New Roman"/>
-          <w:sz w:val="24"/>
-        </w:rPr>
-        <w:t>a</w:t>
-      </w:r>
-      <w:r>
-        <w:rPr>
-          <w:rFonts w:ascii="Times New Roman" w:hAnsi="Times New Roman" w:cs="Times New Roman"/>
-          <w:spacing w:val="-3"/>
-          <w:sz w:val="24"/>
-        </w:rPr>
-        <w:t xml:space="preserve"> </w:t>
-      </w:r>
-      <w:r>
-        <w:rPr>
-          <w:rFonts w:ascii="Times New Roman" w:hAnsi="Times New Roman" w:cs="Times New Roman"/>
-          <w:sz w:val="24"/>
-        </w:rPr>
-        <w:t>presente</w:t>
-      </w:r>
-      <w:r>
-        <w:rPr>
-          <w:rFonts w:ascii="Times New Roman" w:hAnsi="Times New Roman" w:cs="Times New Roman"/>
-          <w:spacing w:val="-1"/>
-          <w:sz w:val="24"/>
-        </w:rPr>
-        <w:t xml:space="preserve"> </w:t>
-      </w:r>
-      <w:r>
-        <w:rPr>
-          <w:rFonts w:ascii="Times New Roman" w:hAnsi="Times New Roman" w:cs="Times New Roman"/>
-          <w:spacing w:val="-2"/>
-          <w:sz w:val="24"/>
-        </w:rPr>
-        <w:t>solicitação</w:t>
-      </w:r>
-      <w:r>
-        <w:rPr>
-          <w:rFonts w:ascii="Times New Roman" w:hAnsi="Times New Roman" w:cs="Times New Roman"/>
-          <w:b/>
-          <w:spacing w:val="-2"/>
-          <w:sz w:val="24"/>
-        </w:rPr>
-        <w:t>.</w:t>
-      </w:r>
-    </w:p>
-    <w:p>
-      <w:pPr>
-        <w:spacing w:line="360" w:lineRule="auto"/>
-        <w:ind w:left="1310"/>
-        <w:jc w:val="both"/>
-        <w:rPr>
-          <w:rFonts w:ascii="Times New Roman" w:hAnsi="Times New Roman" w:cs="Times New Roman"/>
-          <w:b/>
-          <w:sz w:val="24"/>
-        </w:rPr>
-      </w:pPr>
+      <w:r>
+        <w:rPr>
+          <w:rFonts w:ascii="Times New Roman" w:hAnsi="Times New Roman" w:cs="Times New Roman"/>
+        </w:rPr>
+        <w:t xml:space="preserve">Diante do exposto, constatou-se </w:t>
+      </w:r>
+      <w:r>
+        <w:rPr>
+          <w:rFonts w:ascii="Times New Roman" w:hAnsi="Times New Roman" w:cs="Times New Roman"/>
+        </w:rPr>
+        <w:t>que existe indicação técnica para atendimento à solicitação.</w:t>
+      </w:r>
     </w:p>
     <w:p>
       <w:pPr>
@@ -772,39 +642,15 @@
       <w:r>
         <w:rPr>
           <w:rFonts w:ascii="Times New Roman" w:hAnsi="Times New Roman" w:cs="Times New Roman"/>
-          <w:spacing w:val="-2"/>
         </w:rPr>
         <w:t>Atenciosamente,</w:t>
       </w:r>
-    </w:p>
-    <w:p>
-      <w:pPr>
-        <w:pStyle w:val="Corpodetexto"/>
-        <w:jc w:val="both"/>
-        <w:rPr>
-          <w:rFonts w:ascii="Times New Roman" w:hAnsi="Times New Roman" w:cs="Times New Roman"/>
-        </w:rPr>
-      </w:pPr>
-    </w:p>
-    <w:p>
-      <w:pPr>
-        <w:pStyle w:val="Corpodetexto"/>
-        <w:jc w:val="both"/>
-        <w:rPr>
-          <w:rFonts w:ascii="Times New Roman" w:hAnsi="Times New Roman" w:cs="Times New Roman"/>
-        </w:rPr>
-      </w:pPr>
     </w:p>
     <w:p>
       <w:pPr>
         <w:pStyle w:val="Ttulo"/>
         <w:ind w:left="0"/>
         <w:jc w:val="both"/>
-        <w:rPr>
-          <w:rFonts w:eastAsia="Arial MT"/>
-          <w:b w:val="0"/>
-          <w:bCs w:val="0"/>
-        </w:rPr>
       </w:pPr>
     </w:p>
     <w:p>
@@ -812,132 +658,280 @@
         <w:pStyle w:val="Ttulo"/>
         <w:ind w:left="0"/>
         <w:jc w:val="both"/>
-        <w:rPr>
-          <w:rFonts w:eastAsia="Arial MT"/>
-          <w:b w:val="0"/>
-          <w:bCs w:val="0"/>
-        </w:rPr>
       </w:pPr>
     </w:p>
     <w:p>
       <w:pPr>
         <w:pStyle w:val="Ttulo"/>
+        <w:ind w:left="0"/>
+        <w:jc w:val="both"/>
+      </w:pPr>
+    </w:p>
+    <w:p>
+      <w:pPr>
+        <w:pStyle w:val="Ttulo"/>
+        <w:ind w:left="2160" w:firstLine="720"/>
+        <w:jc w:val="both"/>
+      </w:pPr>
+      <w:r>
+        <w:t>Melissandro</w:t>
+      </w:r>
+      <w:r>
+        <w:rPr>
+          <w:spacing w:val="-2"/>
+        </w:rPr>
+        <w:t xml:space="preserve"> </w:t>
+      </w:r>
+      <w:r>
+        <w:t>Eduardo</w:t>
+      </w:r>
+      <w:r>
+        <w:rPr>
+          <w:spacing w:val="-1"/>
+        </w:rPr>
+        <w:t xml:space="preserve"> </w:t>
+      </w:r>
+      <w:r>
+        <w:rPr>
+          <w:spacing w:val="-2"/>
+        </w:rPr>
+        <w:t>Farinon</w:t>
+      </w:r>
+    </w:p>
+    <w:p>
+      <w:pPr>
+        <w:pStyle w:val="Corpodetexto"/>
+        <w:spacing w:line="275" w:lineRule="exact"/>
+        <w:ind w:left="2160" w:right="2" w:firstLine="720"/>
+        <w:jc w:val="both"/>
+        <w:rPr>
+          <w:rFonts w:ascii="Times New Roman" w:hAnsi="Times New Roman" w:cs="Times New Roman"/>
+        </w:rPr>
+      </w:pPr>
+      <w:r>
+        <w:rPr>
+          <w:rFonts w:ascii="Times New Roman" w:hAnsi="Times New Roman" w:cs="Times New Roman"/>
+        </w:rPr>
+        <w:t>Chefe</w:t>
+      </w:r>
+      <w:r>
+        <w:rPr>
+          <w:rFonts w:ascii="Times New Roman" w:hAnsi="Times New Roman" w:cs="Times New Roman"/>
+          <w:spacing w:val="-9"/>
+        </w:rPr>
+        <w:t xml:space="preserve"> </w:t>
+      </w:r>
+      <w:r>
+        <w:rPr>
+          <w:rFonts w:ascii="Times New Roman" w:hAnsi="Times New Roman" w:cs="Times New Roman"/>
+        </w:rPr>
+        <w:t>de</w:t>
+      </w:r>
+      <w:r>
+        <w:rPr>
+          <w:rFonts w:ascii="Times New Roman" w:hAnsi="Times New Roman" w:cs="Times New Roman"/>
+          <w:spacing w:val="-8"/>
+        </w:rPr>
+        <w:t xml:space="preserve"> </w:t>
+      </w:r>
+      <w:r>
+        <w:rPr>
+          <w:rFonts w:ascii="Times New Roman" w:hAnsi="Times New Roman" w:cs="Times New Roman"/>
+        </w:rPr>
+        <w:t>Divisão</w:t>
+      </w:r>
+      <w:r>
+        <w:rPr>
+          <w:rFonts w:ascii="Times New Roman" w:hAnsi="Times New Roman" w:cs="Times New Roman"/>
+          <w:spacing w:val="-6"/>
+        </w:rPr>
+        <w:t xml:space="preserve"> </w:t>
+      </w:r>
+      <w:r>
+        <w:rPr>
+          <w:rFonts w:ascii="Times New Roman" w:hAnsi="Times New Roman" w:cs="Times New Roman"/>
+        </w:rPr>
+        <w:t>de</w:t>
+      </w:r>
+      <w:r>
+        <w:rPr>
+          <w:rFonts w:ascii="Times New Roman" w:hAnsi="Times New Roman" w:cs="Times New Roman"/>
+          <w:spacing w:val="-9"/>
+        </w:rPr>
+        <w:t xml:space="preserve"> </w:t>
+      </w:r>
+      <w:r>
+        <w:rPr>
+          <w:rFonts w:ascii="Times New Roman" w:hAnsi="Times New Roman" w:cs="Times New Roman"/>
+          <w:spacing w:val="-2"/>
+        </w:rPr>
+        <w:t>Planejamento</w:t>
+      </w:r>
+    </w:p>
+    <w:p>
+      <w:pPr>
+        <w:pStyle w:val="Corpodetexto"/>
+        <w:jc w:val="both"/>
+        <w:rPr>
+          <w:rFonts w:ascii="Times New Roman" w:hAnsi="Times New Roman" w:cs="Times New Roman"/>
+        </w:rPr>
+      </w:pPr>
+    </w:p>
+    <w:p>
+      <w:pPr>
+        <w:pStyle w:val="Corpodetexto"/>
+        <w:jc w:val="both"/>
+        <w:rPr>
+          <w:rFonts w:ascii="Times New Roman" w:hAnsi="Times New Roman" w:cs="Times New Roman"/>
+        </w:rPr>
+      </w:pPr>
+    </w:p>
+    <w:p>
+      <w:pPr>
+        <w:pStyle w:val="Corpodetexto"/>
+        <w:jc w:val="both"/>
+        <w:rPr>
+          <w:rFonts w:ascii="Times New Roman" w:hAnsi="Times New Roman" w:cs="Times New Roman"/>
+        </w:rPr>
+      </w:pPr>
+    </w:p>
+    <w:p>
+      <w:pPr>
+        <w:pStyle w:val="Corpodetexto"/>
+        <w:jc w:val="both"/>
+        <w:rPr>
+          <w:rFonts w:ascii="Times New Roman" w:hAnsi="Times New Roman" w:cs="Times New Roman"/>
+        </w:rPr>
+      </w:pPr>
+    </w:p>
+    <w:p>
+      <w:pPr>
+        <w:spacing w:before="1" w:line="360" w:lineRule="auto"/>
+        <w:ind w:firstLine="720"/>
+        <w:jc w:val="both"/>
+        <w:rPr>
+          <w:rFonts w:ascii="Times New Roman" w:hAnsi="Times New Roman" w:cs="Times New Roman"/>
+          <w:sz w:val="24"/>
+          <w:szCs w:val="24"/>
+        </w:rPr>
+      </w:pPr>
+      <w:r>
+        <w:rPr>
+          <w:rFonts w:ascii="Times New Roman" w:hAnsi="Times New Roman" w:cs="Times New Roman"/>
+          <w:sz w:val="24"/>
+          <w:szCs w:val="24"/>
+        </w:rPr>
+        <w:t>De acordo:</w:t>
+      </w:r>
+    </w:p>
+    <w:p>
+      <w:pPr>
+        <w:spacing w:before="1"/>
         <w:ind w:left="2880"/>
         <w:jc w:val="both"/>
-      </w:pPr>
-      <w:r>
-        <w:rPr>
-          <w:rFonts w:eastAsia="Arial MT"/>
-          <w:b w:val="0"/>
-          <w:bCs w:val="0"/>
-        </w:rPr>
-        <w:t xml:space="preserve">   </w:t>
-      </w:r>
-      <w:r>
-        <w:t>Melissandro</w:t>
-      </w:r>
-      <w:r>
-        <w:rPr>
+        <w:rPr>
+          <w:rFonts w:ascii="Times New Roman" w:hAnsi="Times New Roman" w:cs="Times New Roman"/>
+          <w:b/>
+          <w:sz w:val="24"/>
+        </w:rPr>
+      </w:pPr>
+      <w:r>
+        <w:rPr>
+          <w:rFonts w:ascii="Times New Roman" w:hAnsi="Times New Roman" w:cs="Times New Roman"/>
+          <w:b/>
+          <w:sz w:val="24"/>
+        </w:rPr>
+        <w:t xml:space="preserve">      </w:t>
+      </w:r>
+      <w:bookmarkStart w:id="0" w:name="_GoBack"/>
+      <w:bookmarkEnd w:id="0"/>
+      <w:r>
+        <w:rPr>
+          <w:rFonts w:ascii="Times New Roman" w:hAnsi="Times New Roman" w:cs="Times New Roman"/>
+          <w:b/>
+          <w:sz w:val="24"/>
+        </w:rPr>
+        <w:t xml:space="preserve"> </w:t>
+      </w:r>
+      <w:r>
+        <w:rPr>
+          <w:rFonts w:ascii="Times New Roman" w:hAnsi="Times New Roman" w:cs="Times New Roman"/>
+          <w:b/>
+          <w:sz w:val="24"/>
+        </w:rPr>
+        <w:t>J</w:t>
+      </w:r>
+      <w:r>
+        <w:rPr>
+          <w:rFonts w:ascii="Times New Roman" w:hAnsi="Times New Roman" w:cs="Times New Roman"/>
+          <w:b/>
+          <w:sz w:val="24"/>
+        </w:rPr>
+        <w:t>ardson</w:t>
+      </w:r>
+      <w:r>
+        <w:rPr>
+          <w:rFonts w:ascii="Times New Roman" w:hAnsi="Times New Roman" w:cs="Times New Roman"/>
+          <w:b/>
+          <w:spacing w:val="-4"/>
+          <w:sz w:val="24"/>
+        </w:rPr>
+        <w:t xml:space="preserve"> </w:t>
+      </w:r>
+      <w:r>
+        <w:rPr>
+          <w:rFonts w:ascii="Times New Roman" w:hAnsi="Times New Roman" w:cs="Times New Roman"/>
+          <w:sz w:val="24"/>
+        </w:rPr>
+        <w:t>Saraiva</w:t>
+      </w:r>
+      <w:r>
+        <w:rPr>
+          <w:rFonts w:ascii="Times New Roman" w:hAnsi="Times New Roman" w:cs="Times New Roman"/>
+          <w:spacing w:val="-1"/>
+          <w:sz w:val="24"/>
+        </w:rPr>
+        <w:t xml:space="preserve"> </w:t>
+      </w:r>
+      <w:r>
+        <w:rPr>
+          <w:rFonts w:ascii="Times New Roman" w:hAnsi="Times New Roman" w:cs="Times New Roman"/>
+          <w:b/>
+          <w:spacing w:val="-4"/>
+          <w:sz w:val="24"/>
+        </w:rPr>
+        <w:t>Cruz</w:t>
+      </w:r>
+    </w:p>
+    <w:p>
+      <w:pPr>
+        <w:pStyle w:val="Corpodetexto"/>
+        <w:spacing w:before="3"/>
+        <w:ind w:left="2880" w:firstLine="720"/>
+        <w:jc w:val="both"/>
+        <w:rPr>
+          <w:rFonts w:ascii="Times New Roman" w:hAnsi="Times New Roman" w:cs="Times New Roman"/>
+        </w:rPr>
+      </w:pPr>
+      <w:r>
+        <w:rPr>
+          <w:rFonts w:ascii="Times New Roman" w:hAnsi="Times New Roman" w:cs="Times New Roman"/>
+        </w:rPr>
+        <w:t>Diretor</w:t>
+      </w:r>
+      <w:r>
+        <w:rPr>
+          <w:rFonts w:ascii="Times New Roman" w:hAnsi="Times New Roman" w:cs="Times New Roman"/>
+          <w:spacing w:val="-7"/>
+        </w:rPr>
+        <w:t xml:space="preserve"> </w:t>
+      </w:r>
+      <w:r>
+        <w:rPr>
+          <w:rFonts w:ascii="Times New Roman" w:hAnsi="Times New Roman" w:cs="Times New Roman"/>
           <w:spacing w:val="-2"/>
         </w:rPr>
-        <w:t xml:space="preserve"> </w:t>
-      </w:r>
-      <w:r>
-        <w:t>Eduardo</w:t>
-      </w:r>
-      <w:r>
-        <w:rPr>
-          <w:spacing w:val="-1"/>
-        </w:rPr>
-        <w:t xml:space="preserve"> </w:t>
-      </w:r>
-      <w:r>
-        <w:rPr>
-          <w:spacing w:val="-2"/>
-        </w:rPr>
-        <w:t>Farinon</w:t>
-      </w:r>
-    </w:p>
-    <w:p>
-      <w:pPr>
-        <w:pStyle w:val="Corpodetexto"/>
-        <w:spacing w:line="275" w:lineRule="exact"/>
-        <w:ind w:left="1716" w:right="2" w:firstLine="444"/>
-        <w:jc w:val="both"/>
-        <w:rPr>
-          <w:rFonts w:ascii="Times New Roman" w:hAnsi="Times New Roman" w:cs="Times New Roman"/>
-        </w:rPr>
-      </w:pPr>
-      <w:r>
-        <w:rPr>
-          <w:rFonts w:ascii="Times New Roman" w:hAnsi="Times New Roman" w:cs="Times New Roman"/>
-        </w:rPr>
-        <w:t xml:space="preserve"> </w:t>
-      </w:r>
-      <w:r>
-        <w:rPr>
-          <w:rFonts w:ascii="Times New Roman" w:hAnsi="Times New Roman" w:cs="Times New Roman"/>
-        </w:rPr>
-        <w:tab/>
-      </w:r>
-      <w:r>
-        <w:rPr>
-          <w:rFonts w:ascii="Times New Roman" w:hAnsi="Times New Roman" w:cs="Times New Roman"/>
-        </w:rPr>
-        <w:t>Chefe</w:t>
-      </w:r>
-      <w:r>
-        <w:rPr>
-          <w:rFonts w:ascii="Times New Roman" w:hAnsi="Times New Roman" w:cs="Times New Roman"/>
-          <w:spacing w:val="-9"/>
-        </w:rPr>
-        <w:t xml:space="preserve"> </w:t>
-      </w:r>
-      <w:r>
-        <w:rPr>
-          <w:rFonts w:ascii="Times New Roman" w:hAnsi="Times New Roman" w:cs="Times New Roman"/>
-        </w:rPr>
-        <w:t>de</w:t>
-      </w:r>
-      <w:r>
-        <w:rPr>
-          <w:rFonts w:ascii="Times New Roman" w:hAnsi="Times New Roman" w:cs="Times New Roman"/>
-          <w:spacing w:val="-8"/>
-        </w:rPr>
-        <w:t xml:space="preserve"> </w:t>
-      </w:r>
-      <w:r>
-        <w:rPr>
-          <w:rFonts w:ascii="Times New Roman" w:hAnsi="Times New Roman" w:cs="Times New Roman"/>
-        </w:rPr>
-        <w:t>Divisão</w:t>
-      </w:r>
-      <w:r>
-        <w:rPr>
-          <w:rFonts w:ascii="Times New Roman" w:hAnsi="Times New Roman" w:cs="Times New Roman"/>
-          <w:spacing w:val="-6"/>
-        </w:rPr>
-        <w:t xml:space="preserve"> </w:t>
-      </w:r>
-      <w:r>
-        <w:rPr>
-          <w:rFonts w:ascii="Times New Roman" w:hAnsi="Times New Roman" w:cs="Times New Roman"/>
-        </w:rPr>
-        <w:t>de</w:t>
-      </w:r>
-      <w:r>
-        <w:rPr>
-          <w:rFonts w:ascii="Times New Roman" w:hAnsi="Times New Roman" w:cs="Times New Roman"/>
-          <w:spacing w:val="-9"/>
-        </w:rPr>
-        <w:t xml:space="preserve"> </w:t>
-      </w:r>
-      <w:r>
-        <w:rPr>
-          <w:rFonts w:ascii="Times New Roman" w:hAnsi="Times New Roman" w:cs="Times New Roman"/>
-          <w:spacing w:val="-2"/>
-        </w:rPr>
-        <w:t>Planejamento</w:t>
+        <w:t>Técnico</w:t>
       </w:r>
     </w:p>
     <w:p>
@@ -951,147 +945,9 @@
     </w:p>
     <w:p>
       <w:pPr>
-        <w:spacing w:before="1"/>
-        <w:jc w:val="both"/>
-        <w:rPr>
-          <w:rFonts w:ascii="Times New Roman" w:hAnsi="Times New Roman" w:cs="Times New Roman"/>
-          <w:sz w:val="24"/>
-          <w:szCs w:val="24"/>
-        </w:rPr>
-      </w:pPr>
-    </w:p>
-    <w:p>
-      <w:pPr>
-        <w:spacing w:before="1"/>
-        <w:jc w:val="both"/>
-        <w:rPr>
-          <w:rFonts w:ascii="Times New Roman" w:hAnsi="Times New Roman" w:cs="Times New Roman"/>
-          <w:sz w:val="24"/>
-          <w:szCs w:val="24"/>
-        </w:rPr>
-      </w:pPr>
-    </w:p>
-    <w:p>
-      <w:pPr>
-        <w:spacing w:before="1"/>
-        <w:jc w:val="both"/>
-        <w:rPr>
-          <w:rFonts w:ascii="Times New Roman" w:hAnsi="Times New Roman" w:cs="Times New Roman"/>
-          <w:sz w:val="24"/>
-          <w:szCs w:val="24"/>
-        </w:rPr>
-      </w:pPr>
-    </w:p>
-    <w:p>
-      <w:pPr>
-        <w:spacing w:before="1"/>
-        <w:ind w:left="2880" w:firstLine="720"/>
-        <w:jc w:val="both"/>
-        <w:rPr>
-          <w:rFonts w:ascii="Times New Roman" w:hAnsi="Times New Roman" w:cs="Times New Roman"/>
-          <w:b/>
-          <w:sz w:val="24"/>
-        </w:rPr>
-      </w:pPr>
-      <w:r>
-        <w:rPr>
-          <w:rFonts w:ascii="Times New Roman" w:hAnsi="Times New Roman" w:cs="Times New Roman"/>
-          <w:b/>
-          <w:sz w:val="24"/>
-        </w:rPr>
-        <w:t>Jardson</w:t>
-      </w:r>
-      <w:r>
-        <w:rPr>
-          <w:rFonts w:ascii="Times New Roman" w:hAnsi="Times New Roman" w:cs="Times New Roman"/>
-          <w:b/>
-          <w:spacing w:val="-4"/>
-          <w:sz w:val="24"/>
-        </w:rPr>
-        <w:t xml:space="preserve"> </w:t>
-      </w:r>
-      <w:r>
-        <w:rPr>
-          <w:rFonts w:ascii="Times New Roman" w:hAnsi="Times New Roman" w:cs="Times New Roman"/>
-          <w:sz w:val="24"/>
-        </w:rPr>
-        <w:t>Saraiva</w:t>
-      </w:r>
-      <w:r>
-        <w:rPr>
-          <w:rFonts w:ascii="Times New Roman" w:hAnsi="Times New Roman" w:cs="Times New Roman"/>
-          <w:spacing w:val="-1"/>
-          <w:sz w:val="24"/>
-        </w:rPr>
-        <w:t xml:space="preserve"> </w:t>
-      </w:r>
-      <w:r>
-        <w:rPr>
-          <w:rFonts w:ascii="Times New Roman" w:hAnsi="Times New Roman" w:cs="Times New Roman"/>
-          <w:b/>
-          <w:spacing w:val="-4"/>
-          <w:sz w:val="24"/>
-        </w:rPr>
-        <w:t>Cruz</w:t>
-      </w:r>
-    </w:p>
-    <w:p>
-      <w:pPr>
         <w:pStyle w:val="Corpodetexto"/>
-        <w:spacing w:before="3"/>
-        <w:ind w:left="3600"/>
-        <w:jc w:val="both"/>
-        <w:rPr>
-          <w:rFonts w:ascii="Times New Roman" w:hAnsi="Times New Roman" w:cs="Times New Roman"/>
-        </w:rPr>
-      </w:pPr>
-      <w:r>
-        <w:rPr>
-          <w:rFonts w:ascii="Times New Roman" w:hAnsi="Times New Roman" w:cs="Times New Roman"/>
-        </w:rPr>
-        <w:t xml:space="preserve">     </w:t>
-      </w:r>
-      <w:r>
-        <w:rPr>
-          <w:rFonts w:ascii="Times New Roman" w:hAnsi="Times New Roman" w:cs="Times New Roman"/>
-        </w:rPr>
-        <w:t xml:space="preserve"> </w:t>
-      </w:r>
-      <w:r>
-        <w:rPr>
-          <w:rFonts w:ascii="Times New Roman" w:hAnsi="Times New Roman" w:cs="Times New Roman"/>
-        </w:rPr>
-        <w:t>Diretor</w:t>
-      </w:r>
-      <w:r>
-        <w:rPr>
-          <w:rFonts w:ascii="Times New Roman" w:hAnsi="Times New Roman" w:cs="Times New Roman"/>
-          <w:spacing w:val="-7"/>
-        </w:rPr>
-        <w:t xml:space="preserve"> </w:t>
-      </w:r>
-      <w:r>
-        <w:rPr>
-          <w:rFonts w:ascii="Times New Roman" w:hAnsi="Times New Roman" w:cs="Times New Roman"/>
-          <w:spacing w:val="-2"/>
-        </w:rPr>
-        <w:t>Técnico</w:t>
-      </w:r>
-    </w:p>
-    <w:p>
-      <w:pPr>
-        <w:pStyle w:val="Corpodetexto"/>
-        <w:jc w:val="both"/>
-        <w:rPr>
-          <w:sz w:val="18"/>
-        </w:rPr>
-      </w:pPr>
-    </w:p>
-    <w:p>
-      <w:pPr>
-        <w:pStyle w:val="Corpodetexto"/>
-        <w:rPr>
-          <w:sz w:val="18"/>
+        <w:rPr>
+          <w:rFonts w:ascii="Times New Roman" w:hAnsi="Times New Roman" w:cs="Times New Roman"/>
         </w:rPr>
       </w:pPr>
     </w:p>
@@ -1100,7 +956,7 @@
         <w:pStyle w:val="Corpodetexto"/>
         <w:spacing w:before="140"/>
         <w:rPr>
-          <w:sz w:val="18"/>
+          <w:rFonts w:ascii="Times New Roman" w:hAnsi="Times New Roman" w:cs="Times New Roman"/>
         </w:rPr>
       </w:pPr>
     </w:p>
@@ -1252,7 +1108,7 @@
           </mc:Choice>
           <mc:Fallback>
             <w:pict>
-              <v:group w14:anchorId="2E563B69" id="Group 1" o:spid="_x0000_s1026" style="position:absolute;margin-left:0;margin-top:809.4pt;width:595.45pt;height:32.2pt;z-index:251658752;mso-wrap-distance-left:0;mso-wrap-distance-right:0;mso-position-horizontal-relative:page;mso-position-vertical-relative:page;mso-height-relative:margin" coordsize="75622,4089" o:gfxdata="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">
+              <v:group w14:anchorId="64BC92E2" id="Group 1" o:spid="_x0000_s1026" style="position:absolute;margin-left:0;margin-top:809.4pt;width:595.45pt;height:32.2pt;z-index:251658752;mso-wrap-distance-left:0;mso-wrap-distance-right:0;mso-position-horizontal-relative:page;mso-position-vertical-relative:page;mso-height-relative:margin" coordsize="75622,4089" o:gfxdata="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">
                 <v:shapetype id="_x0000_t75" coordsize="21600,21600" o:spt="75" o:preferrelative="t" path="m@4@5l@4@11@9@11@9@5xe" filled="f" stroked="f">
                   <v:stroke joinstyle="miter"/>
                   <v:formulas>
@@ -1287,6 +1143,61 @@
           </mc:Fallback>
         </mc:AlternateContent>
       </w:r>
+    </w:p>
+    <w:p>
+      <w:pPr>
+        <w:ind w:left="590"/>
+        <w:rPr>
+          <w:rFonts w:ascii="Arial"/>
+          <w:b/>
+          <w:color w:val="3D3D3E"/>
+          <w:sz w:val="18"/>
+        </w:rPr>
+      </w:pPr>
+    </w:p>
+    <w:p>
+      <w:pPr>
+        <w:ind w:left="590"/>
+        <w:rPr>
+          <w:rFonts w:ascii="Arial"/>
+          <w:b/>
+          <w:color w:val="3D3D3E"/>
+          <w:sz w:val="18"/>
+        </w:rPr>
+      </w:pPr>
+    </w:p>
+    <w:p>
+      <w:pPr>
+        <w:ind w:left="590"/>
+        <w:rPr>
+          <w:rFonts w:ascii="Arial"/>
+          <w:b/>
+          <w:color w:val="3D3D3E"/>
+          <w:sz w:val="18"/>
+        </w:rPr>
+      </w:pPr>
+    </w:p>
+    <w:p>
+      <w:pPr>
+        <w:ind w:left="590"/>
+        <w:rPr>
+          <w:rFonts w:ascii="Arial"/>
+          <w:b/>
+          <w:color w:val="3D3D3E"/>
+          <w:sz w:val="18"/>
+        </w:rPr>
+      </w:pPr>
+    </w:p>
+    <w:p>
+      <w:pPr>
+        <w:ind w:left="590"/>
+        <w:rPr>
+          <w:rFonts w:ascii="Arial"/>
+          <w:b/>
+          <w:color w:val="3D3D3E"/>
+          <w:sz w:val="18"/>
+        </w:rPr>
+      </w:pPr>
     </w:p>
     <w:p>
       <w:pPr>

</xml_diff>